<commit_message>
Added notes and program
</commit_message>
<xml_diff>
--- a/Third Semester/Labsheet/web lab/output-images/images.docx
+++ b/Third Semester/Labsheet/web lab/output-images/images.docx
@@ -8,13 +8,184 @@
           <w:noProof/>
         </w:rPr>
         <w:drawing>
-          <wp:anchor distT="0" distB="0" distL="114300" distR="114300" simplePos="0" relativeHeight="251661312" behindDoc="0" locked="0" layoutInCell="1" allowOverlap="1" wp14:anchorId="3251763D" wp14:editId="3D03E792">
+          <wp:anchor distT="0" distB="0" distL="114300" distR="114300" simplePos="0" relativeHeight="251658240" behindDoc="0" locked="0" layoutInCell="1" allowOverlap="1" wp14:anchorId="50BD1E2F" wp14:editId="4F0C75CF">
             <wp:simplePos x="0" y="0"/>
             <wp:positionH relativeFrom="column">
-              <wp:posOffset>-106045</wp:posOffset>
+              <wp:posOffset>3827332</wp:posOffset>
             </wp:positionH>
             <wp:positionV relativeFrom="paragraph">
-              <wp:posOffset>5940913</wp:posOffset>
+              <wp:posOffset>13447</wp:posOffset>
+            </wp:positionV>
+            <wp:extent cx="3488238" cy="3281082"/>
+            <wp:effectExtent l="0" t="0" r="0" b="0"/>
+            <wp:wrapSquare wrapText="bothSides"/>
+            <wp:docPr id="4" name="Picture 4"/>
+            <wp:cNvGraphicFramePr>
+              <a:graphicFrameLocks xmlns:a="http://schemas.openxmlformats.org/drawingml/2006/main" noChangeAspect="1"/>
+            </wp:cNvGraphicFramePr>
+            <a:graphic xmlns:a="http://schemas.openxmlformats.org/drawingml/2006/main">
+              <a:graphicData uri="http://schemas.openxmlformats.org/drawingml/2006/picture">
+                <pic:pic xmlns:pic="http://schemas.openxmlformats.org/drawingml/2006/picture">
+                  <pic:nvPicPr>
+                    <pic:cNvPr id="1" name=""/>
+                    <pic:cNvPicPr/>
+                  </pic:nvPicPr>
+                  <pic:blipFill>
+                    <a:blip r:embed="rId4">
+                      <a:extLst>
+                        <a:ext uri="{28A0092B-C50C-407E-A947-70E740481C1C}">
+                          <a14:useLocalDpi xmlns:a14="http://schemas.microsoft.com/office/drawing/2010/main" val="0"/>
+                        </a:ext>
+                      </a:extLst>
+                    </a:blip>
+                    <a:stretch>
+                      <a:fillRect/>
+                    </a:stretch>
+                  </pic:blipFill>
+                  <pic:spPr>
+                    <a:xfrm>
+                      <a:off x="0" y="0"/>
+                      <a:ext cx="3488238" cy="3281082"/>
+                    </a:xfrm>
+                    <a:prstGeom prst="rect">
+                      <a:avLst/>
+                    </a:prstGeom>
+                  </pic:spPr>
+                </pic:pic>
+              </a:graphicData>
+            </a:graphic>
+            <wp14:sizeRelH relativeFrom="margin">
+              <wp14:pctWidth>0</wp14:pctWidth>
+            </wp14:sizeRelH>
+            <wp14:sizeRelV relativeFrom="margin">
+              <wp14:pctHeight>0</wp14:pctHeight>
+            </wp14:sizeRelV>
+          </wp:anchor>
+        </w:drawing>
+      </w:r>
+      <w:r>
+        <w:rPr>
+          <w:noProof/>
+        </w:rPr>
+        <w:drawing>
+          <wp:anchor distT="0" distB="0" distL="114300" distR="114300" simplePos="0" relativeHeight="251660288" behindDoc="0" locked="0" layoutInCell="1" allowOverlap="1" wp14:anchorId="3DFBAEA9" wp14:editId="0AABCE4F">
+            <wp:simplePos x="0" y="0"/>
+            <wp:positionH relativeFrom="column">
+              <wp:posOffset>3418205</wp:posOffset>
+            </wp:positionH>
+            <wp:positionV relativeFrom="paragraph">
+              <wp:posOffset>3895276</wp:posOffset>
+            </wp:positionV>
+            <wp:extent cx="3826314" cy="2361565"/>
+            <wp:effectExtent l="0" t="0" r="3175" b="635"/>
+            <wp:wrapSquare wrapText="bothSides"/>
+            <wp:docPr id="6" name="Picture 6"/>
+            <wp:cNvGraphicFramePr>
+              <a:graphicFrameLocks xmlns:a="http://schemas.openxmlformats.org/drawingml/2006/main" noChangeAspect="1"/>
+            </wp:cNvGraphicFramePr>
+            <a:graphic xmlns:a="http://schemas.openxmlformats.org/drawingml/2006/main">
+              <a:graphicData uri="http://schemas.openxmlformats.org/drawingml/2006/picture">
+                <pic:pic xmlns:pic="http://schemas.openxmlformats.org/drawingml/2006/picture">
+                  <pic:nvPicPr>
+                    <pic:cNvPr id="1" name=""/>
+                    <pic:cNvPicPr/>
+                  </pic:nvPicPr>
+                  <pic:blipFill>
+                    <a:blip r:embed="rId5">
+                      <a:extLst>
+                        <a:ext uri="{28A0092B-C50C-407E-A947-70E740481C1C}">
+                          <a14:useLocalDpi xmlns:a14="http://schemas.microsoft.com/office/drawing/2010/main" val="0"/>
+                        </a:ext>
+                      </a:extLst>
+                    </a:blip>
+                    <a:stretch>
+                      <a:fillRect/>
+                    </a:stretch>
+                  </pic:blipFill>
+                  <pic:spPr>
+                    <a:xfrm>
+                      <a:off x="0" y="0"/>
+                      <a:ext cx="3826314" cy="2361565"/>
+                    </a:xfrm>
+                    <a:prstGeom prst="rect">
+                      <a:avLst/>
+                    </a:prstGeom>
+                  </pic:spPr>
+                </pic:pic>
+              </a:graphicData>
+            </a:graphic>
+            <wp14:sizeRelH relativeFrom="margin">
+              <wp14:pctWidth>0</wp14:pctWidth>
+            </wp14:sizeRelH>
+          </wp:anchor>
+        </w:drawing>
+      </w:r>
+      <w:r>
+        <w:rPr>
+          <w:noProof/>
+        </w:rPr>
+        <w:drawing>
+          <wp:anchor distT="0" distB="0" distL="114300" distR="114300" simplePos="0" relativeHeight="251662336" behindDoc="0" locked="0" layoutInCell="1" allowOverlap="1" wp14:anchorId="2ADE7F9B" wp14:editId="081803BC">
+            <wp:simplePos x="0" y="0"/>
+            <wp:positionH relativeFrom="column">
+              <wp:posOffset>3494026</wp:posOffset>
+            </wp:positionH>
+            <wp:positionV relativeFrom="paragraph">
+              <wp:posOffset>6829873</wp:posOffset>
+            </wp:positionV>
+            <wp:extent cx="3747601" cy="1759324"/>
+            <wp:effectExtent l="0" t="0" r="5715" b="0"/>
+            <wp:wrapSquare wrapText="bothSides"/>
+            <wp:docPr id="2" name="Picture 2"/>
+            <wp:cNvGraphicFramePr>
+              <a:graphicFrameLocks xmlns:a="http://schemas.openxmlformats.org/drawingml/2006/main" noChangeAspect="1"/>
+            </wp:cNvGraphicFramePr>
+            <a:graphic xmlns:a="http://schemas.openxmlformats.org/drawingml/2006/main">
+              <a:graphicData uri="http://schemas.openxmlformats.org/drawingml/2006/picture">
+                <pic:pic xmlns:pic="http://schemas.openxmlformats.org/drawingml/2006/picture">
+                  <pic:nvPicPr>
+                    <pic:cNvPr id="1" name=""/>
+                    <pic:cNvPicPr/>
+                  </pic:nvPicPr>
+                  <pic:blipFill>
+                    <a:blip r:embed="rId6">
+                      <a:extLst>
+                        <a:ext uri="{28A0092B-C50C-407E-A947-70E740481C1C}">
+                          <a14:useLocalDpi xmlns:a14="http://schemas.microsoft.com/office/drawing/2010/main" val="0"/>
+                        </a:ext>
+                      </a:extLst>
+                    </a:blip>
+                    <a:stretch>
+                      <a:fillRect/>
+                    </a:stretch>
+                  </pic:blipFill>
+                  <pic:spPr>
+                    <a:xfrm>
+                      <a:off x="0" y="0"/>
+                      <a:ext cx="3747601" cy="1759324"/>
+                    </a:xfrm>
+                    <a:prstGeom prst="rect">
+                      <a:avLst/>
+                    </a:prstGeom>
+                  </pic:spPr>
+                </pic:pic>
+              </a:graphicData>
+            </a:graphic>
+          </wp:anchor>
+        </w:drawing>
+      </w:r>
+      <w:r>
+        <w:rPr>
+          <w:noProof/>
+        </w:rPr>
+        <w:drawing>
+          <wp:anchor distT="0" distB="0" distL="114300" distR="114300" simplePos="0" relativeHeight="251661312" behindDoc="0" locked="0" layoutInCell="1" allowOverlap="1" wp14:anchorId="3251763D" wp14:editId="462FA21E">
+            <wp:simplePos x="0" y="0"/>
+            <wp:positionH relativeFrom="column">
+              <wp:posOffset>-240516</wp:posOffset>
+            </wp:positionH>
+            <wp:positionV relativeFrom="paragraph">
+              <wp:posOffset>5940910</wp:posOffset>
             </wp:positionV>
             <wp:extent cx="3321050" cy="3192780"/>
             <wp:effectExtent l="0" t="0" r="0" b="7620"/>
@@ -31,7 +202,7 @@
                     <pic:cNvPicPr/>
                   </pic:nvPicPr>
                   <pic:blipFill>
-                    <a:blip r:embed="rId4">
+                    <a:blip r:embed="rId7">
                       <a:extLst>
                         <a:ext uri="{28A0092B-C50C-407E-A947-70E740481C1C}">
                           <a14:useLocalDpi xmlns:a14="http://schemas.microsoft.com/office/drawing/2010/main" val="0"/>
@@ -65,7 +236,7 @@
           <w:noProof/>
         </w:rPr>
         <w:drawing>
-          <wp:anchor distT="0" distB="0" distL="114300" distR="114300" simplePos="0" relativeHeight="251659264" behindDoc="0" locked="0" layoutInCell="1" allowOverlap="1" wp14:anchorId="4C97AE4D" wp14:editId="7A550E50">
+          <wp:anchor distT="0" distB="0" distL="114300" distR="114300" simplePos="0" relativeHeight="251659264" behindDoc="0" locked="0" layoutInCell="1" allowOverlap="1" wp14:anchorId="4C97AE4D" wp14:editId="4E4F5D83">
             <wp:simplePos x="0" y="0"/>
             <wp:positionH relativeFrom="column">
               <wp:posOffset>-246380</wp:posOffset>
@@ -88,7 +259,7 @@
                     <pic:cNvPicPr/>
                   </pic:nvPicPr>
                   <pic:blipFill>
-                    <a:blip r:embed="rId5">
+                    <a:blip r:embed="rId8">
                       <a:extLst>
                         <a:ext uri="{28A0092B-C50C-407E-A947-70E740481C1C}">
                           <a14:useLocalDpi xmlns:a14="http://schemas.microsoft.com/office/drawing/2010/main" val="0"/>
@@ -121,177 +292,17 @@
         </w:drawing>
       </w:r>
       <w:r>
+        <w:t>`</w:t>
+      </w:r>
+      <w:r>
         <w:rPr>
           <w:noProof/>
         </w:rPr>
         <w:drawing>
-          <wp:anchor distT="0" distB="0" distL="114300" distR="114300" simplePos="0" relativeHeight="251660288" behindDoc="0" locked="0" layoutInCell="1" allowOverlap="1" wp14:anchorId="3DFBAEA9" wp14:editId="5891ABDC">
-            <wp:simplePos x="0" y="0"/>
-            <wp:positionH relativeFrom="column">
-              <wp:posOffset>3485613</wp:posOffset>
-            </wp:positionH>
-            <wp:positionV relativeFrom="paragraph">
-              <wp:posOffset>3073400</wp:posOffset>
-            </wp:positionV>
-            <wp:extent cx="3826314" cy="2361565"/>
-            <wp:effectExtent l="0" t="0" r="3175" b="635"/>
-            <wp:wrapSquare wrapText="bothSides"/>
-            <wp:docPr id="6" name="Picture 6"/>
-            <wp:cNvGraphicFramePr>
-              <a:graphicFrameLocks xmlns:a="http://schemas.openxmlformats.org/drawingml/2006/main" noChangeAspect="1"/>
-            </wp:cNvGraphicFramePr>
-            <a:graphic xmlns:a="http://schemas.openxmlformats.org/drawingml/2006/main">
-              <a:graphicData uri="http://schemas.openxmlformats.org/drawingml/2006/picture">
-                <pic:pic xmlns:pic="http://schemas.openxmlformats.org/drawingml/2006/picture">
-                  <pic:nvPicPr>
-                    <pic:cNvPr id="1" name=""/>
-                    <pic:cNvPicPr/>
-                  </pic:nvPicPr>
-                  <pic:blipFill>
-                    <a:blip r:embed="rId6">
-                      <a:extLst>
-                        <a:ext uri="{28A0092B-C50C-407E-A947-70E740481C1C}">
-                          <a14:useLocalDpi xmlns:a14="http://schemas.microsoft.com/office/drawing/2010/main" val="0"/>
-                        </a:ext>
-                      </a:extLst>
-                    </a:blip>
-                    <a:stretch>
-                      <a:fillRect/>
-                    </a:stretch>
-                  </pic:blipFill>
-                  <pic:spPr>
-                    <a:xfrm>
-                      <a:off x="0" y="0"/>
-                      <a:ext cx="3826314" cy="2361565"/>
-                    </a:xfrm>
-                    <a:prstGeom prst="rect">
-                      <a:avLst/>
-                    </a:prstGeom>
-                  </pic:spPr>
-                </pic:pic>
-              </a:graphicData>
-            </a:graphic>
-            <wp14:sizeRelH relativeFrom="margin">
-              <wp14:pctWidth>0</wp14:pctWidth>
-            </wp14:sizeRelH>
-          </wp:anchor>
-        </w:drawing>
-      </w:r>
-      <w:r>
-        <w:rPr>
-          <w:noProof/>
-        </w:rPr>
-        <w:drawing>
-          <wp:anchor distT="0" distB="0" distL="114300" distR="114300" simplePos="0" relativeHeight="251658240" behindDoc="0" locked="0" layoutInCell="1" allowOverlap="1" wp14:anchorId="50BD1E2F" wp14:editId="6179E29D">
-            <wp:simplePos x="0" y="0"/>
-            <wp:positionH relativeFrom="column">
-              <wp:posOffset>3827047</wp:posOffset>
-            </wp:positionH>
-            <wp:positionV relativeFrom="paragraph">
-              <wp:posOffset>6985</wp:posOffset>
-            </wp:positionV>
-            <wp:extent cx="3488690" cy="2742565"/>
-            <wp:effectExtent l="0" t="0" r="0" b="635"/>
-            <wp:wrapSquare wrapText="bothSides"/>
-            <wp:docPr id="4" name="Picture 4"/>
-            <wp:cNvGraphicFramePr>
-              <a:graphicFrameLocks xmlns:a="http://schemas.openxmlformats.org/drawingml/2006/main" noChangeAspect="1"/>
-            </wp:cNvGraphicFramePr>
-            <a:graphic xmlns:a="http://schemas.openxmlformats.org/drawingml/2006/main">
-              <a:graphicData uri="http://schemas.openxmlformats.org/drawingml/2006/picture">
-                <pic:pic xmlns:pic="http://schemas.openxmlformats.org/drawingml/2006/picture">
-                  <pic:nvPicPr>
-                    <pic:cNvPr id="1" name=""/>
-                    <pic:cNvPicPr/>
-                  </pic:nvPicPr>
-                  <pic:blipFill>
-                    <a:blip r:embed="rId7">
-                      <a:extLst>
-                        <a:ext uri="{28A0092B-C50C-407E-A947-70E740481C1C}">
-                          <a14:useLocalDpi xmlns:a14="http://schemas.microsoft.com/office/drawing/2010/main" val="0"/>
-                        </a:ext>
-                      </a:extLst>
-                    </a:blip>
-                    <a:stretch>
-                      <a:fillRect/>
-                    </a:stretch>
-                  </pic:blipFill>
-                  <pic:spPr>
-                    <a:xfrm>
-                      <a:off x="0" y="0"/>
-                      <a:ext cx="3488690" cy="2742565"/>
-                    </a:xfrm>
-                    <a:prstGeom prst="rect">
-                      <a:avLst/>
-                    </a:prstGeom>
-                  </pic:spPr>
-                </pic:pic>
-              </a:graphicData>
-            </a:graphic>
-            <wp14:sizeRelH relativeFrom="margin">
-              <wp14:pctWidth>0</wp14:pctWidth>
-            </wp14:sizeRelH>
-            <wp14:sizeRelV relativeFrom="margin">
-              <wp14:pctHeight>0</wp14:pctHeight>
-            </wp14:sizeRelV>
-          </wp:anchor>
-        </w:drawing>
-      </w:r>
-      <w:r>
-        <w:t>`</w:t>
-      </w:r>
-      <w:r>
-        <w:rPr>
-          <w:noProof/>
-        </w:rPr>
-        <w:drawing>
-          <wp:inline distT="0" distB="0" distL="0" distR="0" wp14:anchorId="5D9C3E19" wp14:editId="67E7B792">
+          <wp:inline distT="0" distB="0" distL="0" distR="0" wp14:anchorId="5D9C3E19" wp14:editId="56858FC6">
             <wp:extent cx="3573145" cy="2883535"/>
             <wp:effectExtent l="0" t="0" r="8255" b="0"/>
             <wp:docPr id="1" name="Picture 1"/>
-            <wp:cNvGraphicFramePr>
-              <a:graphicFrameLocks xmlns:a="http://schemas.openxmlformats.org/drawingml/2006/main" noChangeAspect="1"/>
-            </wp:cNvGraphicFramePr>
-            <a:graphic xmlns:a="http://schemas.openxmlformats.org/drawingml/2006/main">
-              <a:graphicData uri="http://schemas.openxmlformats.org/drawingml/2006/picture">
-                <pic:pic xmlns:pic="http://schemas.openxmlformats.org/drawingml/2006/picture">
-                  <pic:nvPicPr>
-                    <pic:cNvPr id="1" name=""/>
-                    <pic:cNvPicPr/>
-                  </pic:nvPicPr>
-                  <pic:blipFill>
-                    <a:blip r:embed="rId8"/>
-                    <a:stretch>
-                      <a:fillRect/>
-                    </a:stretch>
-                  </pic:blipFill>
-                  <pic:spPr>
-                    <a:xfrm>
-                      <a:off x="0" y="0"/>
-                      <a:ext cx="3576076" cy="2885900"/>
-                    </a:xfrm>
-                    <a:prstGeom prst="rect">
-                      <a:avLst/>
-                    </a:prstGeom>
-                  </pic:spPr>
-                </pic:pic>
-              </a:graphicData>
-            </a:graphic>
-          </wp:inline>
-        </w:drawing>
-      </w:r>
-    </w:p>
-    <w:p>
-      <w:r>
-        <w:rPr>
-          <w:noProof/>
-        </w:rPr>
-        <w:lastRenderedPageBreak/>
-        <w:drawing>
-          <wp:inline distT="0" distB="0" distL="0" distR="0" wp14:anchorId="7CC05021" wp14:editId="467CD17E">
-            <wp:extent cx="6858000" cy="1781810"/>
-            <wp:effectExtent l="0" t="0" r="0" b="8890"/>
-            <wp:docPr id="8" name="Picture 8"/>
             <wp:cNvGraphicFramePr>
               <a:graphicFrameLocks xmlns:a="http://schemas.openxmlformats.org/drawingml/2006/main" noChangeAspect="1"/>
             </wp:cNvGraphicFramePr>
@@ -311,7 +322,7 @@
                   <pic:spPr>
                     <a:xfrm>
                       <a:off x="0" y="0"/>
-                      <a:ext cx="6858000" cy="1781810"/>
+                      <a:ext cx="3576076" cy="2885900"/>
                     </a:xfrm>
                     <a:prstGeom prst="rect">
                       <a:avLst/>
@@ -324,6 +335,899 @@
         </w:drawing>
       </w:r>
     </w:p>
+    <w:p>
+      <w:pPr>
+        <w:rPr>
+          <w:noProof/>
+        </w:rPr>
+      </w:pPr>
+      <w:r>
+        <w:rPr>
+          <w:noProof/>
+        </w:rPr>
+        <w:lastRenderedPageBreak/>
+        <w:drawing>
+          <wp:anchor distT="0" distB="0" distL="114300" distR="114300" simplePos="0" relativeHeight="251665408" behindDoc="0" locked="0" layoutInCell="1" allowOverlap="1" wp14:anchorId="286A82E8" wp14:editId="73012285">
+            <wp:simplePos x="0" y="0"/>
+            <wp:positionH relativeFrom="column">
+              <wp:posOffset>-444500</wp:posOffset>
+            </wp:positionH>
+            <wp:positionV relativeFrom="paragraph">
+              <wp:posOffset>5458460</wp:posOffset>
+            </wp:positionV>
+            <wp:extent cx="6858000" cy="1046480"/>
+            <wp:effectExtent l="0" t="0" r="0" b="1270"/>
+            <wp:wrapSquare wrapText="bothSides"/>
+            <wp:docPr id="11" name="Picture 11"/>
+            <wp:cNvGraphicFramePr>
+              <a:graphicFrameLocks xmlns:a="http://schemas.openxmlformats.org/drawingml/2006/main" noChangeAspect="1"/>
+            </wp:cNvGraphicFramePr>
+            <a:graphic xmlns:a="http://schemas.openxmlformats.org/drawingml/2006/main">
+              <a:graphicData uri="http://schemas.openxmlformats.org/drawingml/2006/picture">
+                <pic:pic xmlns:pic="http://schemas.openxmlformats.org/drawingml/2006/picture">
+                  <pic:nvPicPr>
+                    <pic:cNvPr id="11" name="Picture 11"/>
+                    <pic:cNvPicPr/>
+                  </pic:nvPicPr>
+                  <pic:blipFill>
+                    <a:blip r:embed="rId10" cstate="print">
+                      <a:extLst>
+                        <a:ext uri="{28A0092B-C50C-407E-A947-70E740481C1C}">
+                          <a14:useLocalDpi xmlns:a14="http://schemas.microsoft.com/office/drawing/2010/main" val="0"/>
+                        </a:ext>
+                      </a:extLst>
+                    </a:blip>
+                    <a:stretch>
+                      <a:fillRect/>
+                    </a:stretch>
+                  </pic:blipFill>
+                  <pic:spPr>
+                    <a:xfrm>
+                      <a:off x="0" y="0"/>
+                      <a:ext cx="6858000" cy="1046480"/>
+                    </a:xfrm>
+                    <a:prstGeom prst="rect">
+                      <a:avLst/>
+                    </a:prstGeom>
+                  </pic:spPr>
+                </pic:pic>
+              </a:graphicData>
+            </a:graphic>
+            <wp14:sizeRelV relativeFrom="margin">
+              <wp14:pctHeight>0</wp14:pctHeight>
+            </wp14:sizeRelV>
+          </wp:anchor>
+        </w:drawing>
+      </w:r>
+      <w:r>
+        <w:rPr>
+          <w:noProof/>
+        </w:rPr>
+        <w:drawing>
+          <wp:anchor distT="0" distB="0" distL="114300" distR="114300" simplePos="0" relativeHeight="251663360" behindDoc="0" locked="0" layoutInCell="1" allowOverlap="1" wp14:anchorId="3F5AF306" wp14:editId="0AD1C6C0">
+            <wp:simplePos x="0" y="0"/>
+            <wp:positionH relativeFrom="column">
+              <wp:posOffset>-381000</wp:posOffset>
+            </wp:positionH>
+            <wp:positionV relativeFrom="paragraph">
+              <wp:posOffset>2124075</wp:posOffset>
+            </wp:positionV>
+            <wp:extent cx="7691120" cy="1855470"/>
+            <wp:effectExtent l="0" t="0" r="5080" b="0"/>
+            <wp:wrapSquare wrapText="bothSides"/>
+            <wp:docPr id="9" name="Picture 9"/>
+            <wp:cNvGraphicFramePr>
+              <a:graphicFrameLocks xmlns:a="http://schemas.openxmlformats.org/drawingml/2006/main" noChangeAspect="1"/>
+            </wp:cNvGraphicFramePr>
+            <a:graphic xmlns:a="http://schemas.openxmlformats.org/drawingml/2006/main">
+              <a:graphicData uri="http://schemas.openxmlformats.org/drawingml/2006/picture">
+                <pic:pic xmlns:pic="http://schemas.openxmlformats.org/drawingml/2006/picture">
+                  <pic:nvPicPr>
+                    <pic:cNvPr id="1" name=""/>
+                    <pic:cNvPicPr/>
+                  </pic:nvPicPr>
+                  <pic:blipFill>
+                    <a:blip r:embed="rId11">
+                      <a:extLst>
+                        <a:ext uri="{28A0092B-C50C-407E-A947-70E740481C1C}">
+                          <a14:useLocalDpi xmlns:a14="http://schemas.microsoft.com/office/drawing/2010/main" val="0"/>
+                        </a:ext>
+                      </a:extLst>
+                    </a:blip>
+                    <a:stretch>
+                      <a:fillRect/>
+                    </a:stretch>
+                  </pic:blipFill>
+                  <pic:spPr>
+                    <a:xfrm>
+                      <a:off x="0" y="0"/>
+                      <a:ext cx="7691120" cy="1855470"/>
+                    </a:xfrm>
+                    <a:prstGeom prst="rect">
+                      <a:avLst/>
+                    </a:prstGeom>
+                  </pic:spPr>
+                </pic:pic>
+              </a:graphicData>
+            </a:graphic>
+            <wp14:sizeRelH relativeFrom="margin">
+              <wp14:pctWidth>0</wp14:pctWidth>
+            </wp14:sizeRelH>
+            <wp14:sizeRelV relativeFrom="margin">
+              <wp14:pctHeight>0</wp14:pctHeight>
+            </wp14:sizeRelV>
+          </wp:anchor>
+        </w:drawing>
+      </w:r>
+      <w:r>
+        <w:rPr>
+          <w:noProof/>
+        </w:rPr>
+        <w:t xml:space="preserve"> </w:t>
+      </w:r>
+      <w:r>
+        <w:rPr>
+          <w:noProof/>
+        </w:rPr>
+        <w:t xml:space="preserve"> </w:t>
+      </w:r>
+      <w:r>
+        <w:rPr>
+          <w:noProof/>
+        </w:rPr>
+        <w:t xml:space="preserve"> </w:t>
+      </w:r>
+      <w:r>
+        <w:rPr>
+          <w:noProof/>
+        </w:rPr>
+        <w:t xml:space="preserve"> </w:t>
+      </w:r>
+      <w:r>
+        <w:rPr>
+          <w:noProof/>
+        </w:rPr>
+        <w:drawing>
+          <wp:inline distT="0" distB="0" distL="0" distR="0" wp14:anchorId="7CC05021" wp14:editId="10523A8D">
+            <wp:extent cx="6858000" cy="1707314"/>
+            <wp:effectExtent l="0" t="0" r="0" b="7620"/>
+            <wp:docPr id="8" name="Picture 8"/>
+            <wp:cNvGraphicFramePr>
+              <a:graphicFrameLocks xmlns:a="http://schemas.openxmlformats.org/drawingml/2006/main" noChangeAspect="1"/>
+            </wp:cNvGraphicFramePr>
+            <a:graphic xmlns:a="http://schemas.openxmlformats.org/drawingml/2006/main">
+              <a:graphicData uri="http://schemas.openxmlformats.org/drawingml/2006/picture">
+                <pic:pic xmlns:pic="http://schemas.openxmlformats.org/drawingml/2006/picture">
+                  <pic:nvPicPr>
+                    <pic:cNvPr id="8" name="Picture 8"/>
+                    <pic:cNvPicPr/>
+                  </pic:nvPicPr>
+                  <pic:blipFill>
+                    <a:blip r:embed="rId12">
+                      <a:extLst>
+                        <a:ext uri="{28A0092B-C50C-407E-A947-70E740481C1C}">
+                          <a14:useLocalDpi xmlns:a14="http://schemas.microsoft.com/office/drawing/2010/main" val="0"/>
+                        </a:ext>
+                      </a:extLst>
+                    </a:blip>
+                    <a:stretch>
+                      <a:fillRect/>
+                    </a:stretch>
+                  </pic:blipFill>
+                  <pic:spPr>
+                    <a:xfrm>
+                      <a:off x="0" y="0"/>
+                      <a:ext cx="6858000" cy="1707314"/>
+                    </a:xfrm>
+                    <a:prstGeom prst="rect">
+                      <a:avLst/>
+                    </a:prstGeom>
+                  </pic:spPr>
+                </pic:pic>
+              </a:graphicData>
+            </a:graphic>
+          </wp:inline>
+        </w:drawing>
+      </w:r>
+    </w:p>
+    <w:p>
+      <w:pPr>
+        <w:rPr>
+          <w:noProof/>
+        </w:rPr>
+      </w:pPr>
+      <w:r>
+        <w:rPr>
+          <w:noProof/>
+        </w:rPr>
+        <w:drawing>
+          <wp:anchor distT="0" distB="0" distL="114300" distR="114300" simplePos="0" relativeHeight="251664384" behindDoc="0" locked="0" layoutInCell="1" allowOverlap="1" wp14:anchorId="6C66EC68" wp14:editId="5DB7087C">
+            <wp:simplePos x="0" y="0"/>
+            <wp:positionH relativeFrom="column">
+              <wp:posOffset>-314960</wp:posOffset>
+            </wp:positionH>
+            <wp:positionV relativeFrom="paragraph">
+              <wp:posOffset>1965325</wp:posOffset>
+            </wp:positionV>
+            <wp:extent cx="6654800" cy="1372235"/>
+            <wp:effectExtent l="0" t="0" r="0" b="0"/>
+            <wp:wrapSquare wrapText="bothSides"/>
+            <wp:docPr id="10" name="Picture 10"/>
+            <wp:cNvGraphicFramePr>
+              <a:graphicFrameLocks xmlns:a="http://schemas.openxmlformats.org/drawingml/2006/main" noChangeAspect="1"/>
+            </wp:cNvGraphicFramePr>
+            <a:graphic xmlns:a="http://schemas.openxmlformats.org/drawingml/2006/main">
+              <a:graphicData uri="http://schemas.openxmlformats.org/drawingml/2006/picture">
+                <pic:pic xmlns:pic="http://schemas.openxmlformats.org/drawingml/2006/picture">
+                  <pic:nvPicPr>
+                    <pic:cNvPr id="1" name=""/>
+                    <pic:cNvPicPr/>
+                  </pic:nvPicPr>
+                  <pic:blipFill>
+                    <a:blip r:embed="rId13" cstate="print">
+                      <a:extLst>
+                        <a:ext uri="{28A0092B-C50C-407E-A947-70E740481C1C}">
+                          <a14:useLocalDpi xmlns:a14="http://schemas.microsoft.com/office/drawing/2010/main" val="0"/>
+                        </a:ext>
+                      </a:extLst>
+                    </a:blip>
+                    <a:stretch>
+                      <a:fillRect/>
+                    </a:stretch>
+                  </pic:blipFill>
+                  <pic:spPr>
+                    <a:xfrm>
+                      <a:off x="0" y="0"/>
+                      <a:ext cx="6654800" cy="1372235"/>
+                    </a:xfrm>
+                    <a:prstGeom prst="rect">
+                      <a:avLst/>
+                    </a:prstGeom>
+                  </pic:spPr>
+                </pic:pic>
+              </a:graphicData>
+            </a:graphic>
+            <wp14:sizeRelH relativeFrom="margin">
+              <wp14:pctWidth>0</wp14:pctWidth>
+            </wp14:sizeRelH>
+            <wp14:sizeRelV relativeFrom="margin">
+              <wp14:pctHeight>0</wp14:pctHeight>
+            </wp14:sizeRelV>
+          </wp:anchor>
+        </w:drawing>
+      </w:r>
+    </w:p>
+    <w:p>
+      <w:pPr>
+        <w:rPr>
+          <w:noProof/>
+        </w:rPr>
+      </w:pPr>
+    </w:p>
+    <w:p>
+      <w:pPr>
+        <w:rPr>
+          <w:noProof/>
+        </w:rPr>
+      </w:pPr>
+    </w:p>
+    <w:p>
+      <w:pPr>
+        <w:rPr>
+          <w:noProof/>
+        </w:rPr>
+      </w:pPr>
+    </w:p>
+    <w:p>
+      <w:pPr>
+        <w:rPr>
+          <w:noProof/>
+        </w:rPr>
+      </w:pPr>
+    </w:p>
+    <w:p>
+      <w:pPr>
+        <w:rPr>
+          <w:noProof/>
+        </w:rPr>
+      </w:pPr>
+    </w:p>
+    <w:p>
+      <w:pPr>
+        <w:rPr>
+          <w:noProof/>
+        </w:rPr>
+      </w:pPr>
+    </w:p>
+    <w:p>
+      <w:pPr>
+        <w:rPr>
+          <w:noProof/>
+        </w:rPr>
+      </w:pPr>
+    </w:p>
+    <w:p>
+      <w:pPr>
+        <w:rPr>
+          <w:noProof/>
+        </w:rPr>
+      </w:pPr>
+    </w:p>
+    <w:p>
+      <w:pPr>
+        <w:rPr>
+          <w:noProof/>
+        </w:rPr>
+      </w:pPr>
+      <w:r>
+        <w:rPr>
+          <w:noProof/>
+        </w:rPr>
+        <w:drawing>
+          <wp:anchor distT="0" distB="0" distL="114300" distR="114300" simplePos="0" relativeHeight="251666432" behindDoc="0" locked="0" layoutInCell="1" allowOverlap="1" wp14:anchorId="022D36A2" wp14:editId="1A7F78FA">
+            <wp:simplePos x="0" y="0"/>
+            <wp:positionH relativeFrom="column">
+              <wp:posOffset>-133350</wp:posOffset>
+            </wp:positionH>
+            <wp:positionV relativeFrom="paragraph">
+              <wp:posOffset>67945</wp:posOffset>
+            </wp:positionV>
+            <wp:extent cx="4415790" cy="1885950"/>
+            <wp:effectExtent l="0" t="0" r="3810" b="0"/>
+            <wp:wrapSquare wrapText="bothSides"/>
+            <wp:docPr id="12" name="Picture 12"/>
+            <wp:cNvGraphicFramePr>
+              <a:graphicFrameLocks xmlns:a="http://schemas.openxmlformats.org/drawingml/2006/main" noChangeAspect="1"/>
+            </wp:cNvGraphicFramePr>
+            <a:graphic xmlns:a="http://schemas.openxmlformats.org/drawingml/2006/main">
+              <a:graphicData uri="http://schemas.openxmlformats.org/drawingml/2006/picture">
+                <pic:pic xmlns:pic="http://schemas.openxmlformats.org/drawingml/2006/picture">
+                  <pic:nvPicPr>
+                    <pic:cNvPr id="12" name="Picture 12"/>
+                    <pic:cNvPicPr/>
+                  </pic:nvPicPr>
+                  <pic:blipFill>
+                    <a:blip r:embed="rId14" cstate="print">
+                      <a:extLst>
+                        <a:ext uri="{28A0092B-C50C-407E-A947-70E740481C1C}">
+                          <a14:useLocalDpi xmlns:a14="http://schemas.microsoft.com/office/drawing/2010/main" val="0"/>
+                        </a:ext>
+                      </a:extLst>
+                    </a:blip>
+                    <a:stretch>
+                      <a:fillRect/>
+                    </a:stretch>
+                  </pic:blipFill>
+                  <pic:spPr>
+                    <a:xfrm>
+                      <a:off x="0" y="0"/>
+                      <a:ext cx="4415790" cy="1885950"/>
+                    </a:xfrm>
+                    <a:prstGeom prst="rect">
+                      <a:avLst/>
+                    </a:prstGeom>
+                  </pic:spPr>
+                </pic:pic>
+              </a:graphicData>
+            </a:graphic>
+            <wp14:sizeRelH relativeFrom="margin">
+              <wp14:pctWidth>0</wp14:pctWidth>
+            </wp14:sizeRelH>
+            <wp14:sizeRelV relativeFrom="margin">
+              <wp14:pctHeight>0</wp14:pctHeight>
+            </wp14:sizeRelV>
+          </wp:anchor>
+        </w:drawing>
+      </w:r>
+    </w:p>
+    <w:p>
+      <w:pPr>
+        <w:rPr>
+          <w:noProof/>
+        </w:rPr>
+      </w:pPr>
+    </w:p>
+    <w:p>
+      <w:pPr>
+        <w:rPr>
+          <w:noProof/>
+        </w:rPr>
+      </w:pPr>
+    </w:p>
+    <w:p>
+      <w:pPr>
+        <w:rPr>
+          <w:noProof/>
+        </w:rPr>
+      </w:pPr>
+    </w:p>
+    <w:p>
+      <w:pPr>
+        <w:rPr>
+          <w:noProof/>
+        </w:rPr>
+      </w:pPr>
+    </w:p>
+    <w:p>
+      <w:pPr>
+        <w:rPr>
+          <w:noProof/>
+        </w:rPr>
+      </w:pPr>
+    </w:p>
+    <w:p>
+      <w:pPr>
+        <w:rPr>
+          <w:noProof/>
+        </w:rPr>
+      </w:pPr>
+    </w:p>
+    <w:p>
+      <w:pPr>
+        <w:rPr>
+          <w:noProof/>
+        </w:rPr>
+      </w:pPr>
+    </w:p>
+    <w:p>
+      <w:pPr>
+        <w:rPr>
+          <w:noProof/>
+        </w:rPr>
+      </w:pPr>
+    </w:p>
+    <w:p>
+      <w:pPr>
+        <w:rPr>
+          <w:noProof/>
+        </w:rPr>
+      </w:pPr>
+      <w:r>
+        <w:rPr>
+          <w:noProof/>
+        </w:rPr>
+        <w:lastRenderedPageBreak/>
+        <w:drawing>
+          <wp:anchor distT="0" distB="0" distL="114300" distR="114300" simplePos="0" relativeHeight="251667456" behindDoc="0" locked="0" layoutInCell="1" allowOverlap="1" wp14:anchorId="233CAB6D" wp14:editId="44D35341">
+            <wp:simplePos x="0" y="0"/>
+            <wp:positionH relativeFrom="column">
+              <wp:posOffset>13767</wp:posOffset>
+            </wp:positionH>
+            <wp:positionV relativeFrom="paragraph">
+              <wp:posOffset>419</wp:posOffset>
+            </wp:positionV>
+            <wp:extent cx="6858000" cy="2132330"/>
+            <wp:effectExtent l="0" t="0" r="0" b="1270"/>
+            <wp:wrapSquare wrapText="bothSides"/>
+            <wp:docPr id="13" name="Picture 13"/>
+            <wp:cNvGraphicFramePr>
+              <a:graphicFrameLocks xmlns:a="http://schemas.openxmlformats.org/drawingml/2006/main" noChangeAspect="1"/>
+            </wp:cNvGraphicFramePr>
+            <a:graphic xmlns:a="http://schemas.openxmlformats.org/drawingml/2006/main">
+              <a:graphicData uri="http://schemas.openxmlformats.org/drawingml/2006/picture">
+                <pic:pic xmlns:pic="http://schemas.openxmlformats.org/drawingml/2006/picture">
+                  <pic:nvPicPr>
+                    <pic:cNvPr id="1" name=""/>
+                    <pic:cNvPicPr/>
+                  </pic:nvPicPr>
+                  <pic:blipFill>
+                    <a:blip r:embed="rId15" cstate="print">
+                      <a:extLst>
+                        <a:ext uri="{28A0092B-C50C-407E-A947-70E740481C1C}">
+                          <a14:useLocalDpi xmlns:a14="http://schemas.microsoft.com/office/drawing/2010/main" val="0"/>
+                        </a:ext>
+                      </a:extLst>
+                    </a:blip>
+                    <a:stretch>
+                      <a:fillRect/>
+                    </a:stretch>
+                  </pic:blipFill>
+                  <pic:spPr>
+                    <a:xfrm>
+                      <a:off x="0" y="0"/>
+                      <a:ext cx="6858000" cy="2132330"/>
+                    </a:xfrm>
+                    <a:prstGeom prst="rect">
+                      <a:avLst/>
+                    </a:prstGeom>
+                  </pic:spPr>
+                </pic:pic>
+              </a:graphicData>
+            </a:graphic>
+          </wp:anchor>
+        </w:drawing>
+      </w:r>
+    </w:p>
+    <w:p/>
+    <w:p>
+      <w:pPr>
+        <w:pStyle w:val="NormalWeb"/>
+      </w:pPr>
+      <w:r>
+        <w:rPr>
+          <w:noProof/>
+        </w:rPr>
+        <w:drawing>
+          <wp:anchor distT="0" distB="0" distL="114300" distR="114300" simplePos="0" relativeHeight="251668480" behindDoc="0" locked="0" layoutInCell="1" allowOverlap="1" wp14:anchorId="10EF887F" wp14:editId="59C479E5">
+            <wp:simplePos x="0" y="0"/>
+            <wp:positionH relativeFrom="column">
+              <wp:posOffset>3219450</wp:posOffset>
+            </wp:positionH>
+            <wp:positionV relativeFrom="paragraph">
+              <wp:posOffset>41275</wp:posOffset>
+            </wp:positionV>
+            <wp:extent cx="3994785" cy="1588135"/>
+            <wp:effectExtent l="0" t="0" r="5715" b="0"/>
+            <wp:wrapSquare wrapText="bothSides"/>
+            <wp:docPr id="15" name="Picture 15"/>
+            <wp:cNvGraphicFramePr>
+              <a:graphicFrameLocks xmlns:a="http://schemas.openxmlformats.org/drawingml/2006/main" noChangeAspect="1"/>
+            </wp:cNvGraphicFramePr>
+            <a:graphic xmlns:a="http://schemas.openxmlformats.org/drawingml/2006/main">
+              <a:graphicData uri="http://schemas.openxmlformats.org/drawingml/2006/picture">
+                <pic:pic xmlns:pic="http://schemas.openxmlformats.org/drawingml/2006/picture">
+                  <pic:nvPicPr>
+                    <pic:cNvPr id="0" name="Picture 1"/>
+                    <pic:cNvPicPr>
+                      <a:picLocks noChangeAspect="1" noChangeArrowheads="1"/>
+                    </pic:cNvPicPr>
+                  </pic:nvPicPr>
+                  <pic:blipFill rotWithShape="1">
+                    <a:blip r:embed="rId16" cstate="print">
+                      <a:extLst>
+                        <a:ext uri="{28A0092B-C50C-407E-A947-70E740481C1C}">
+                          <a14:useLocalDpi xmlns:a14="http://schemas.microsoft.com/office/drawing/2010/main" val="0"/>
+                        </a:ext>
+                      </a:extLst>
+                    </a:blip>
+                    <a:srcRect r="35338"/>
+                    <a:stretch/>
+                  </pic:blipFill>
+                  <pic:spPr bwMode="auto">
+                    <a:xfrm>
+                      <a:off x="0" y="0"/>
+                      <a:ext cx="3994785" cy="1588135"/>
+                    </a:xfrm>
+                    <a:prstGeom prst="rect">
+                      <a:avLst/>
+                    </a:prstGeom>
+                    <a:noFill/>
+                    <a:ln>
+                      <a:noFill/>
+                    </a:ln>
+                    <a:extLst>
+                      <a:ext uri="{53640926-AAD7-44D8-BBD7-CCE9431645EC}">
+                        <a14:shadowObscured xmlns:a14="http://schemas.microsoft.com/office/drawing/2010/main"/>
+                      </a:ext>
+                    </a:extLst>
+                  </pic:spPr>
+                </pic:pic>
+              </a:graphicData>
+            </a:graphic>
+            <wp14:sizeRelH relativeFrom="margin">
+              <wp14:pctWidth>0</wp14:pctWidth>
+            </wp14:sizeRelH>
+          </wp:anchor>
+        </w:drawing>
+      </w:r>
+      <w:r>
+        <w:rPr>
+          <w:noProof/>
+        </w:rPr>
+        <w:drawing>
+          <wp:inline distT="0" distB="0" distL="0" distR="0" wp14:anchorId="2BF1D7B5" wp14:editId="2B902A8D">
+            <wp:extent cx="2946829" cy="1373310"/>
+            <wp:effectExtent l="0" t="0" r="6350" b="0"/>
+            <wp:docPr id="14" name="Picture 14"/>
+            <wp:cNvGraphicFramePr>
+              <a:graphicFrameLocks xmlns:a="http://schemas.openxmlformats.org/drawingml/2006/main" noChangeAspect="1"/>
+            </wp:cNvGraphicFramePr>
+            <a:graphic xmlns:a="http://schemas.openxmlformats.org/drawingml/2006/main">
+              <a:graphicData uri="http://schemas.openxmlformats.org/drawingml/2006/picture">
+                <pic:pic xmlns:pic="http://schemas.openxmlformats.org/drawingml/2006/picture">
+                  <pic:nvPicPr>
+                    <pic:cNvPr id="14" name="Picture 14"/>
+                    <pic:cNvPicPr/>
+                  </pic:nvPicPr>
+                  <pic:blipFill>
+                    <a:blip r:embed="rId17" cstate="print">
+                      <a:extLst>
+                        <a:ext uri="{28A0092B-C50C-407E-A947-70E740481C1C}">
+                          <a14:useLocalDpi xmlns:a14="http://schemas.microsoft.com/office/drawing/2010/main" val="0"/>
+                        </a:ext>
+                      </a:extLst>
+                    </a:blip>
+                    <a:stretch>
+                      <a:fillRect/>
+                    </a:stretch>
+                  </pic:blipFill>
+                  <pic:spPr>
+                    <a:xfrm>
+                      <a:off x="0" y="0"/>
+                      <a:ext cx="2946829" cy="1373310"/>
+                    </a:xfrm>
+                    <a:prstGeom prst="rect">
+                      <a:avLst/>
+                    </a:prstGeom>
+                  </pic:spPr>
+                </pic:pic>
+              </a:graphicData>
+            </a:graphic>
+          </wp:inline>
+        </w:drawing>
+      </w:r>
+    </w:p>
+    <w:p>
+      <w:r>
+        <w:rPr>
+          <w:noProof/>
+        </w:rPr>
+        <w:drawing>
+          <wp:anchor distT="0" distB="0" distL="114300" distR="114300" simplePos="0" relativeHeight="251670528" behindDoc="0" locked="0" layoutInCell="1" allowOverlap="1" wp14:anchorId="287B69A0" wp14:editId="14BAE2C6">
+            <wp:simplePos x="0" y="0"/>
+            <wp:positionH relativeFrom="column">
+              <wp:posOffset>3141980</wp:posOffset>
+            </wp:positionH>
+            <wp:positionV relativeFrom="paragraph">
+              <wp:posOffset>243205</wp:posOffset>
+            </wp:positionV>
+            <wp:extent cx="4060825" cy="2191385"/>
+            <wp:effectExtent l="0" t="0" r="0" b="0"/>
+            <wp:wrapSquare wrapText="bothSides"/>
+            <wp:docPr id="17" name="Picture 17"/>
+            <wp:cNvGraphicFramePr>
+              <a:graphicFrameLocks xmlns:a="http://schemas.openxmlformats.org/drawingml/2006/main" noChangeAspect="1"/>
+            </wp:cNvGraphicFramePr>
+            <a:graphic xmlns:a="http://schemas.openxmlformats.org/drawingml/2006/main">
+              <a:graphicData uri="http://schemas.openxmlformats.org/drawingml/2006/picture">
+                <pic:pic xmlns:pic="http://schemas.openxmlformats.org/drawingml/2006/picture">
+                  <pic:nvPicPr>
+                    <pic:cNvPr id="1" name=""/>
+                    <pic:cNvPicPr/>
+                  </pic:nvPicPr>
+                  <pic:blipFill rotWithShape="1">
+                    <a:blip r:embed="rId18" cstate="print">
+                      <a:extLst>
+                        <a:ext uri="{28A0092B-C50C-407E-A947-70E740481C1C}">
+                          <a14:useLocalDpi xmlns:a14="http://schemas.microsoft.com/office/drawing/2010/main" val="0"/>
+                        </a:ext>
+                      </a:extLst>
+                    </a:blip>
+                    <a:srcRect l="2779" r="10251"/>
+                    <a:stretch/>
+                  </pic:blipFill>
+                  <pic:spPr bwMode="auto">
+                    <a:xfrm>
+                      <a:off x="0" y="0"/>
+                      <a:ext cx="4060825" cy="2191385"/>
+                    </a:xfrm>
+                    <a:prstGeom prst="rect">
+                      <a:avLst/>
+                    </a:prstGeom>
+                    <a:ln>
+                      <a:noFill/>
+                    </a:ln>
+                    <a:extLst>
+                      <a:ext uri="{53640926-AAD7-44D8-BBD7-CCE9431645EC}">
+                        <a14:shadowObscured xmlns:a14="http://schemas.microsoft.com/office/drawing/2010/main"/>
+                      </a:ext>
+                    </a:extLst>
+                  </pic:spPr>
+                </pic:pic>
+              </a:graphicData>
+            </a:graphic>
+            <wp14:sizeRelH relativeFrom="margin">
+              <wp14:pctWidth>0</wp14:pctWidth>
+            </wp14:sizeRelH>
+            <wp14:sizeRelV relativeFrom="margin">
+              <wp14:pctHeight>0</wp14:pctHeight>
+            </wp14:sizeRelV>
+          </wp:anchor>
+        </w:drawing>
+      </w:r>
+      <w:r>
+        <w:rPr>
+          <w:noProof/>
+        </w:rPr>
+        <w:drawing>
+          <wp:anchor distT="0" distB="0" distL="114300" distR="114300" simplePos="0" relativeHeight="251669504" behindDoc="0" locked="0" layoutInCell="1" allowOverlap="1" wp14:anchorId="1BEF5FE2" wp14:editId="1881D8B0">
+            <wp:simplePos x="0" y="0"/>
+            <wp:positionH relativeFrom="column">
+              <wp:posOffset>-457200</wp:posOffset>
+            </wp:positionH>
+            <wp:positionV relativeFrom="paragraph">
+              <wp:posOffset>113030</wp:posOffset>
+            </wp:positionV>
+            <wp:extent cx="3949065" cy="2495550"/>
+            <wp:effectExtent l="0" t="0" r="0" b="0"/>
+            <wp:wrapSquare wrapText="bothSides"/>
+            <wp:docPr id="16" name="Picture 16"/>
+            <wp:cNvGraphicFramePr>
+              <a:graphicFrameLocks xmlns:a="http://schemas.openxmlformats.org/drawingml/2006/main" noChangeAspect="1"/>
+            </wp:cNvGraphicFramePr>
+            <a:graphic xmlns:a="http://schemas.openxmlformats.org/drawingml/2006/main">
+              <a:graphicData uri="http://schemas.openxmlformats.org/drawingml/2006/picture">
+                <pic:pic xmlns:pic="http://schemas.openxmlformats.org/drawingml/2006/picture">
+                  <pic:nvPicPr>
+                    <pic:cNvPr id="1" name=""/>
+                    <pic:cNvPicPr/>
+                  </pic:nvPicPr>
+                  <pic:blipFill rotWithShape="1">
+                    <a:blip r:embed="rId19">
+                      <a:extLst>
+                        <a:ext uri="{28A0092B-C50C-407E-A947-70E740481C1C}">
+                          <a14:useLocalDpi xmlns:a14="http://schemas.microsoft.com/office/drawing/2010/main" val="0"/>
+                        </a:ext>
+                      </a:extLst>
+                    </a:blip>
+                    <a:srcRect r="22584"/>
+                    <a:stretch/>
+                  </pic:blipFill>
+                  <pic:spPr bwMode="auto">
+                    <a:xfrm>
+                      <a:off x="0" y="0"/>
+                      <a:ext cx="3949065" cy="2495550"/>
+                    </a:xfrm>
+                    <a:prstGeom prst="rect">
+                      <a:avLst/>
+                    </a:prstGeom>
+                    <a:ln>
+                      <a:noFill/>
+                    </a:ln>
+                    <a:extLst>
+                      <a:ext uri="{53640926-AAD7-44D8-BBD7-CCE9431645EC}">
+                        <a14:shadowObscured xmlns:a14="http://schemas.microsoft.com/office/drawing/2010/main"/>
+                      </a:ext>
+                    </a:extLst>
+                  </pic:spPr>
+                </pic:pic>
+              </a:graphicData>
+            </a:graphic>
+            <wp14:sizeRelH relativeFrom="margin">
+              <wp14:pctWidth>0</wp14:pctWidth>
+            </wp14:sizeRelH>
+          </wp:anchor>
+        </w:drawing>
+      </w:r>
+    </w:p>
+    <w:p>
+      <w:r>
+        <w:rPr>
+          <w:noProof/>
+        </w:rPr>
+        <w:drawing>
+          <wp:anchor distT="0" distB="0" distL="114300" distR="114300" simplePos="0" relativeHeight="251671552" behindDoc="0" locked="0" layoutInCell="1" allowOverlap="1" wp14:anchorId="5C562B09" wp14:editId="4CD3D052">
+            <wp:simplePos x="0" y="0"/>
+            <wp:positionH relativeFrom="column">
+              <wp:posOffset>-239086</wp:posOffset>
+            </wp:positionH>
+            <wp:positionV relativeFrom="paragraph">
+              <wp:posOffset>2426044</wp:posOffset>
+            </wp:positionV>
+            <wp:extent cx="3462655" cy="2088858"/>
+            <wp:effectExtent l="0" t="0" r="4445" b="6985"/>
+            <wp:wrapSquare wrapText="bothSides"/>
+            <wp:docPr id="3" name="Picture 3"/>
+            <wp:cNvGraphicFramePr>
+              <a:graphicFrameLocks xmlns:a="http://schemas.openxmlformats.org/drawingml/2006/main" noChangeAspect="1"/>
+            </wp:cNvGraphicFramePr>
+            <a:graphic xmlns:a="http://schemas.openxmlformats.org/drawingml/2006/main">
+              <a:graphicData uri="http://schemas.openxmlformats.org/drawingml/2006/picture">
+                <pic:pic xmlns:pic="http://schemas.openxmlformats.org/drawingml/2006/picture">
+                  <pic:nvPicPr>
+                    <pic:cNvPr id="3" name="Picture 3"/>
+                    <pic:cNvPicPr/>
+                  </pic:nvPicPr>
+                  <pic:blipFill>
+                    <a:blip r:embed="rId20">
+                      <a:extLst>
+                        <a:ext uri="{28A0092B-C50C-407E-A947-70E740481C1C}">
+                          <a14:useLocalDpi xmlns:a14="http://schemas.microsoft.com/office/drawing/2010/main" val="0"/>
+                        </a:ext>
+                      </a:extLst>
+                    </a:blip>
+                    <a:stretch>
+                      <a:fillRect/>
+                    </a:stretch>
+                  </pic:blipFill>
+                  <pic:spPr>
+                    <a:xfrm>
+                      <a:off x="0" y="0"/>
+                      <a:ext cx="3462655" cy="2088858"/>
+                    </a:xfrm>
+                    <a:prstGeom prst="rect">
+                      <a:avLst/>
+                    </a:prstGeom>
+                  </pic:spPr>
+                </pic:pic>
+              </a:graphicData>
+            </a:graphic>
+            <wp14:sizeRelH relativeFrom="margin">
+              <wp14:pctWidth>0</wp14:pctWidth>
+            </wp14:sizeRelH>
+            <wp14:sizeRelV relativeFrom="margin">
+              <wp14:pctHeight>0</wp14:pctHeight>
+            </wp14:sizeRelV>
+          </wp:anchor>
+        </w:drawing>
+      </w:r>
+    </w:p>
+    <w:p>
+      <w:r>
+        <w:rPr>
+          <w:noProof/>
+        </w:rPr>
+        <w:drawing>
+          <wp:anchor distT="0" distB="0" distL="114300" distR="114300" simplePos="0" relativeHeight="251672576" behindDoc="0" locked="0" layoutInCell="1" allowOverlap="1" wp14:anchorId="26659990" wp14:editId="59FEF487">
+            <wp:simplePos x="0" y="0"/>
+            <wp:positionH relativeFrom="column">
+              <wp:posOffset>3870960</wp:posOffset>
+            </wp:positionH>
+            <wp:positionV relativeFrom="paragraph">
+              <wp:posOffset>66040</wp:posOffset>
+            </wp:positionV>
+            <wp:extent cx="3271520" cy="2012315"/>
+            <wp:effectExtent l="0" t="0" r="5080" b="6985"/>
+            <wp:wrapSquare wrapText="bothSides"/>
+            <wp:docPr id="18" name="Picture 18"/>
+            <wp:cNvGraphicFramePr>
+              <a:graphicFrameLocks xmlns:a="http://schemas.openxmlformats.org/drawingml/2006/main" noChangeAspect="1"/>
+            </wp:cNvGraphicFramePr>
+            <a:graphic xmlns:a="http://schemas.openxmlformats.org/drawingml/2006/main">
+              <a:graphicData uri="http://schemas.openxmlformats.org/drawingml/2006/picture">
+                <pic:pic xmlns:pic="http://schemas.openxmlformats.org/drawingml/2006/picture">
+                  <pic:nvPicPr>
+                    <pic:cNvPr id="1" name=""/>
+                    <pic:cNvPicPr/>
+                  </pic:nvPicPr>
+                  <pic:blipFill>
+                    <a:blip r:embed="rId21">
+                      <a:extLst>
+                        <a:ext uri="{28A0092B-C50C-407E-A947-70E740481C1C}">
+                          <a14:useLocalDpi xmlns:a14="http://schemas.microsoft.com/office/drawing/2010/main" val="0"/>
+                        </a:ext>
+                      </a:extLst>
+                    </a:blip>
+                    <a:stretch>
+                      <a:fillRect/>
+                    </a:stretch>
+                  </pic:blipFill>
+                  <pic:spPr>
+                    <a:xfrm>
+                      <a:off x="0" y="0"/>
+                      <a:ext cx="3271520" cy="2012315"/>
+                    </a:xfrm>
+                    <a:prstGeom prst="rect">
+                      <a:avLst/>
+                    </a:prstGeom>
+                  </pic:spPr>
+                </pic:pic>
+              </a:graphicData>
+            </a:graphic>
+            <wp14:sizeRelH relativeFrom="margin">
+              <wp14:pctWidth>0</wp14:pctWidth>
+            </wp14:sizeRelH>
+            <wp14:sizeRelV relativeFrom="margin">
+              <wp14:pctHeight>0</wp14:pctHeight>
+            </wp14:sizeRelV>
+          </wp:anchor>
+        </w:drawing>
+      </w:r>
+    </w:p>
+    <w:p>
+      <w:pPr>
+        <w:tabs>
+          <w:tab w:val="left" w:pos="1236"/>
+        </w:tabs>
+      </w:pPr>
+    </w:p>
+    <w:p/>
+    <w:p/>
+    <w:p/>
+    <w:p/>
+    <w:p/>
+    <w:p/>
+    <w:p/>
     <w:sectPr>
       <w:pgSz w:w="12240" w:h="15840"/>
       <w:pgMar w:top="720" w:right="720" w:bottom="720" w:left="720" w:header="720" w:footer="720" w:gutter="0"/>
@@ -762,6 +1666,24 @@
     <w:semiHidden/>
     <w:unhideWhenUsed/>
   </w:style>
+  <w:style w:type="paragraph" w:styleId="NormalWeb">
+    <w:name w:val="Normal (Web)"/>
+    <w:basedOn w:val="Normal"/>
+    <w:uiPriority w:val="99"/>
+    <w:semiHidden/>
+    <w:unhideWhenUsed/>
+    <w:rsid w:val="00CC715F"/>
+    <w:pPr>
+      <w:spacing w:before="100" w:beforeAutospacing="1" w:after="100" w:afterAutospacing="1" w:line="240" w:lineRule="auto"/>
+    </w:pPr>
+    <w:rPr>
+      <w:rFonts w:ascii="Times New Roman" w:eastAsia="Times New Roman" w:hAnsi="Times New Roman" w:cs="Times New Roman"/>
+      <w:kern w:val="0"/>
+      <w:sz w:val="24"/>
+      <w:szCs w:val="24"/>
+      <w14:ligatures w14:val="none"/>
+    </w:rPr>
+  </w:style>
 </w:styles>
 </file>
 

</xml_diff>